<commit_message>
Handheld vacuums script: picks 230-240 words with fuller specs; add block-length rules
Co-Authored-By: Claude Sonnet 5.5 <noreply@anthropic.com>
</commit_message>
<xml_diff>
--- a/scripts/6-best-cordless-handheld-vacuums-2026.docx
+++ b/scripts/6-best-cordless-handheld-vacuums-2026.docx
@@ -25,7 +25,7 @@
           <w:sz w:val="20"/>
           <w:szCs w:val="20"/>
         </w:rPr>
-        <w:t xml:space="preserve">Script total: 1807 words. Hook type 6 (Category Lie). Villain: Shark CH951.</w:t>
+        <w:t xml:space="preserve">Script total: 1966 words. Hook type 6 (Category Lie). Villain: Shark CH951.</w:t>
       </w:r>
     </w:p>
     <w:p>
@@ -276,7 +276,7 @@
             </w:tcMar>
           </w:tcPr>
           <w:p>
-            <w:hyperlink w:history="1" r:id="rIdz9xbzq0kh0rf9neqfhcmf">
+            <w:hyperlink w:history="1" r:id="rIdcstg7ks2cg3jraqwxry6y">
               <w:r>
                 <w:rPr>
                   <w:rStyle w:val="Hyperlink"/>
@@ -385,7 +385,7 @@
             </w:tcMar>
           </w:tcPr>
           <w:p>
-            <w:hyperlink w:history="1" r:id="rIdaqppi3wzc34gi5n5fcl6f">
+            <w:hyperlink w:history="1" r:id="rId2kxpahzrcfl4rwfu9nmo5">
               <w:r>
                 <w:rPr>
                   <w:rStyle w:val="Hyperlink"/>
@@ -494,7 +494,7 @@
             </w:tcMar>
           </w:tcPr>
           <w:p>
-            <w:hyperlink w:history="1" r:id="rIdn9ws1ijfeqo4rj6mg4tsn">
+            <w:hyperlink w:history="1" r:id="rIdib7ankiyiaxiuid-tpd6u">
               <w:r>
                 <w:rPr>
                   <w:rStyle w:val="Hyperlink"/>
@@ -603,7 +603,7 @@
             </w:tcMar>
           </w:tcPr>
           <w:p>
-            <w:hyperlink w:history="1" r:id="rIdr8xchyp8n0twtpu-w_k4y">
+            <w:hyperlink w:history="1" r:id="rIdurslmztqre1nozmjofabh">
               <w:r>
                 <w:rPr>
                   <w:rStyle w:val="Hyperlink"/>
@@ -712,7 +712,7 @@
             </w:tcMar>
           </w:tcPr>
           <w:p>
-            <w:hyperlink w:history="1" r:id="rId-2qrxyggqu7wi9hnwzblt">
+            <w:hyperlink w:history="1" r:id="rIdse1d6ujuranh-r6avjkco">
               <w:r>
                 <w:rPr>
                   <w:rStyle w:val="Hyperlink"/>
@@ -821,7 +821,7 @@
             </w:tcMar>
           </w:tcPr>
           <w:p>
-            <w:hyperlink w:history="1" r:id="rIdnxb8ohzrd1mhbsjb1dm-p">
+            <w:hyperlink w:history="1" r:id="rIdgdxzbb5gbhzu10leorwwj">
               <w:r>
                 <w:rPr>
                   <w:rStyle w:val="Hyperlink"/>
@@ -930,7 +930,7 @@
             </w:tcMar>
           </w:tcPr>
           <w:p>
-            <w:hyperlink w:history="1" r:id="rId_dzuyjq_rvl7lzltp7hxe">
+            <w:hyperlink w:history="1" r:id="rId3wzomj9rxe8dq6j9qjqtt">
               <w:r>
                 <w:rPr>
                   <w:rStyle w:val="Hyperlink"/>
@@ -1094,7 +1094,7 @@
             </w:tcMar>
           </w:tcPr>
           <w:p>
-            <w:hyperlink w:history="1" r:id="rIdoolh5qhgitai6cirnhhpe">
+            <w:hyperlink w:history="1" r:id="rIdqqfioyzwfkb8aykmcs9hz">
               <w:r>
                 <w:rPr>
                   <w:rStyle w:val="Hyperlink"/>
@@ -1151,7 +1151,7 @@
             </w:tcMar>
           </w:tcPr>
           <w:p>
-            <w:hyperlink w:history="1" r:id="rIdrgkltn8gu7bndwz2_ia8x">
+            <w:hyperlink w:history="1" r:id="rIdznsrojf-wxbfvlebfdl7m">
               <w:r>
                 <w:rPr>
                   <w:rStyle w:val="Hyperlink"/>
@@ -1208,7 +1208,7 @@
             </w:tcMar>
           </w:tcPr>
           <w:p>
-            <w:hyperlink w:history="1" r:id="rId7li7hhxlt0c2uwdrvissx">
+            <w:hyperlink w:history="1" r:id="rId3alfm6y-k_ct_t6rjzmxl">
               <w:r>
                 <w:rPr>
                   <w:rStyle w:val="Hyperlink"/>
@@ -1265,7 +1265,7 @@
             </w:tcMar>
           </w:tcPr>
           <w:p>
-            <w:hyperlink w:history="1" r:id="rIdm2ajk8evkzmli2-jgioza">
+            <w:hyperlink w:history="1" r:id="rId78hzd4qzusfgd5b-1auk3">
               <w:r>
                 <w:rPr>
                   <w:rStyle w:val="Hyperlink"/>
@@ -1322,7 +1322,7 @@
             </w:tcMar>
           </w:tcPr>
           <w:p>
-            <w:hyperlink w:history="1" r:id="rId-au_cu3wiapcdwekpjk2f">
+            <w:hyperlink w:history="1" r:id="rIdomvzn5fxu7r_vokasmpfb">
               <w:r>
                 <w:rPr>
                   <w:rStyle w:val="Hyperlink"/>
@@ -2771,7 +2771,7 @@
           <w:sz w:val="20"/>
           <w:szCs w:val="20"/>
         </w:rPr>
-        <w:t xml:space="preserve">• Compliance grep: no prices, ratings, review counts, past-month, rank or the word Amazon in the script; only benign hits (highest power scores, reviewer). Script ~1,810 words, a little under 1,950.</w:t>
+        <w:t xml:space="preserve">• Compliance grep: no prices, ratings, review counts, past-month, rank or the word Amazon in the script; only benign hits (highest power scores, reviewer). Script ~1,966 words; hook 129, each pick 230-240.</w:t>
       </w:r>
     </w:p>
     <w:p>
@@ -2846,7 +2846,7 @@
           <w:b/>
           <w:bCs/>
         </w:rPr>
-        <w:t xml:space="preserve">NUMBER 6 — Black+Decker Dustbuster HHVI315JO42 — 213 words</w:t>
+        <w:t xml:space="preserve">NUMBER 6 — Black+Decker Dustbuster HHVI315JO42 — 230 words</w:t>
       </w:r>
     </w:p>
     <w:p>
@@ -2882,7 +2882,7 @@
           <w:sz w:val="22"/>
           <w:szCs w:val="22"/>
         </w:rPr>
-        <w:t xml:space="preserve">The listing gives a weight of two point one pounds, a wide-mouth nozzle for scooping up big messes, and a crevice tool for narrow spaces. The dirt bowl is see-through, so you can tell at a glance when it needs emptying, and both the bowl and the filters wash off. The listing says about fifteen minutes of runtime and four hours or so to charge. Black+Decker lists a two-year limited warranty.</w:t>
+        <w:t xml:space="preserve">The listing gives a weight of two point one pounds, a wide-mouth nozzle for scooping up big messes, and a crevice tool for narrow spaces. The dirt bowl is see-through, so you can tell at a glance when it needs emptying, and both the bowl and the filters wash off. The listing says about fifteen minutes of runtime and four hours or so to charge. It runs at seventy-five decibels, the filter is cloth, and a jack-plug charger comes in the box. Black+Decker lists a two-year limited warranty.</w:t>
       </w:r>
     </w:p>
     <w:p>
@@ -2943,7 +2943,7 @@
           <w:b/>
           <w:bCs/>
         </w:rPr>
-        <w:t xml:space="preserve">NUMBER 5 — Dustbuster AdvancedClean CHV1410L — 204 words</w:t>
+        <w:t xml:space="preserve">NUMBER 5 — Dustbuster AdvancedClean CHV1410L — 235 words</w:t>
       </w:r>
     </w:p>
     <w:p>
@@ -2991,7 +2991,7 @@
           <w:sz w:val="22"/>
           <w:szCs w:val="22"/>
         </w:rPr>
-        <w:t xml:space="preserve">The listing gives a sixteen volt lithium battery, about eleven minutes of runtime, and four hours to charge. The bin holds six hundred five milliliters. A flip-up brush and a pull-out crevice tool are built in, and the maker lists a two-year limited warranty.</w:t>
+        <w:t xml:space="preserve">The listing gives a sixteen volt lithium battery, about eleven minutes of runtime, and four hours to charge. The bin holds six hundred five milliliters, and the cleaning path is one point six inches wide, so it is a narrow tool. It runs at seventy-eight decibels, and the cyclonic bin helps keep dust off the filter. A flip-up brush and a pull-out crevice tool are built in, and the maker lists a two-year limited warranty.</w:t>
       </w:r>
     </w:p>
     <w:p>
@@ -3040,7 +3040,7 @@
           <w:b/>
           <w:bCs/>
         </w:rPr>
-        <w:t xml:space="preserve">NUMBER 4 — Shark WANDVAC WV201 — 194 words</w:t>
+        <w:t xml:space="preserve">NUMBER 4 — Shark WANDVAC WV201 — 231 words</w:t>
       </w:r>
     </w:p>
     <w:p>
@@ -3076,7 +3076,7 @@
           <w:sz w:val="22"/>
           <w:szCs w:val="22"/>
         </w:rPr>
-        <w:t xml:space="preserve">The listing gives a weight of one point four pounds, which is the lightest on this list, a brushless motor and a charging dock that keeps it ready. The dust cup comes off for a one-touch empty. It has a single power level and a duster-crevice tool for blinds and shelves, and the listing puts the cleaning path at three point six inches.</w:t>
+        <w:t xml:space="preserve">The listing gives a weight of one point four pounds, which is the lightest on this list, a brushless motor and a charging dock that keeps it ready. The dust cup comes off for a one-touch empty. It has a single power level and a duster-crevice tool for blinds and shelves, and the listing puts the cleaning path at three point six inches. Two accessory slots on the body keep the tools with the vacuum, and it runs at eighty decibels. The listing says its filter captures dust and large debris, and that it suits carpet, upholstery, cars and homes.</w:t>
       </w:r>
     </w:p>
     <w:p>
@@ -3137,7 +3137,7 @@
           <w:b/>
           <w:bCs/>
         </w:rPr>
-        <w:t xml:space="preserve">NUMBER 3 — Black+Decker Furbuster HHVK515JP07 — 204 words</w:t>
+        <w:t xml:space="preserve">NUMBER 3 — Black+Decker Furbuster HHVK515JP07 — 236 words</w:t>
       </w:r>
     </w:p>
     <w:p>
@@ -3173,7 +3173,7 @@
           <w:sz w:val="22"/>
           <w:szCs w:val="22"/>
         </w:rPr>
-        <w:t xml:space="preserve">Vacuum Wars named it the runner-up and gave it the highest power scores in its group. That matches the listing, which has a twenty volt Max battery, a POWERBOOST button for extra suction, and an anti-tangle motorized pet brush with rubber bristles. The bin holds about a fifth of a gallon. The listing says twenty minutes of runtime, two point six pounds, and a two-year limited warranty. Bob Vila's overall winner is a close sibling, the HHVK515J00FF, at thirty-five air watts, with about thirty minutes of runtime. It is not the same model, so I am only using it as a family clue.</w:t>
+        <w:t xml:space="preserve">Vacuum Wars named it the runner-up and gave it the highest power scores in its group. That matches the listing, which has a twenty volt Max battery, a POWERBOOST button for extra suction, and an anti-tangle motorized pet brush with rubber bristles. The bin holds about a fifth of a gallon, and it cleans a path four point two five inches wide. It has two speeds and a one-touch empty button. The filter is washable and replaceable, and charging takes about four hours. The listing says twenty minutes of runtime, two point six pounds, and a two-year limited warranty. Bob Vila's overall winner is a close sibling, the HHVK515J00FF, at thirty-five air watts, with about thirty minutes of runtime. It is not the same model, so I am only using it as a family clue.</w:t>
       </w:r>
     </w:p>
     <w:p>
@@ -3283,7 +3283,7 @@
           <w:b/>
           <w:bCs/>
         </w:rPr>
-        <w:t xml:space="preserve">NUMBER 2 — Dustbuster Pivot Vac BDH2000PL — 197 words</w:t>
+        <w:t xml:space="preserve">NUMBER 2 — Dustbuster Pivot Vac BDH2000PL — 239 words</w:t>
       </w:r>
     </w:p>
     <w:p>
@@ -3319,7 +3319,7 @@
           <w:sz w:val="22"/>
           <w:szCs w:val="22"/>
         </w:rPr>
-        <w:t xml:space="preserve">The listing gives a twenty volt Max lithium battery, a nozzle that pivots two hundred degrees, a flip-up brush, an extendable crevice tool and cyclonic action to keep the filter clean. It comes with a charging dock. The bin holds fifteen ounces, runtime is about ten minutes, and the charge takes four hours. It runs at eighty decibels, and Black+Decker lists a two-year limited warranty.</w:t>
+        <w:t xml:space="preserve">The listing gives a twenty volt Max lithium battery, a nozzle that pivots two hundred degrees, a flip-up brush, an extendable crevice tool and cyclonic action to keep the filter clean. It comes with a charging dock. The cleaning path is one point seven five inches wide, so it is a narrow tool. A pre-filter and a washable filter come with it, and the flip-up brush is on board. The listing recommends it for beds, cars and pet hair. The bin holds fifteen ounces, runtime is about ten minutes, and the charge takes four hours. It runs at eighty decibels, and Black+Decker lists a two-year limited warranty.</w:t>
       </w:r>
     </w:p>
     <w:p>

</xml_diff>